<commit_message>
docs: refresh report verification facts
</commit_message>
<xml_diff>
--- a/研究报告_俄罗斯方块.docx
+++ b/研究报告_俄罗斯方块.docx
@@ -575,7 +575,7 @@
           <w:color w:val="000000"/>
           <w:sz w:val="21"/>
         </w:rPr>
-        <w:t>本项目使用 C# 和 .NET 10 开发一个运行于 Windows x64 的控制台俄罗斯方块。游戏区域固定为 12 列 × 16 行，实现了方块生成、左右移动、旋转、软降、硬降、碰撞检测、消行、计分、等级加速、暂停和游戏结束判定，并以十进制显示分数和消行数。工程采用逻辑与界面分离的结构，核心游戏状态可以独立创建、克隆和测试。除单人模式外，项目还实现了双人本地对战、基于启发式评估的 AI 观战、随机种子和操作序列回放，以及可注入的计分规则接口。持久化方面，最高分使用 XML 保存，历史成绩使用 SQLite 保存并提供排行榜查询，回放使用 JSON 文件保存。项目共包含 75 项 xUnit 测试，覆盖核心规则、AI、双人隔离、回放、存档异常和界面模块。测试和发布验证通过后生成了包含 .NET 运行时的 Windows x64 独立发布目录。本文说明需求理解、系统设计、关键算法、异常处理、测试结果、开发过程和 AI 使用情况，并对当前 Git 提交记录与课程提交要求之间的差距进行如实分析。</w:t>
+        <w:t>本项目使用 C# 和 .NET 10 开发一个运行于 Windows x64 的控制台俄罗斯方块。游戏区域固定为 12 列 × 16 行，实现了方块生成、左右移动、旋转、软降、硬降、碰撞检测、消行、计分、等级加速、暂停和游戏结束判定，并以十进制显示分数和消行数。工程采用逻辑与界面分离的结构，核心游戏状态可以独立创建、克隆和测试。除单人模式外，项目还实现了双人本地对战、基于启发式评估的 AI 观战、随机种子和操作序列回放，以及可注入的计分规则接口。持久化方面，最高分使用 XML 保存，历史成绩使用 SQLite 保存并提供排行榜查询，回放使用 JSON 文件保存。项目共包含 76 项 xUnit 测试，覆盖核心规则、AI、双人隔离、回放、存档异常和界面模块。测试和发布验证通过后生成了包含 .NET 运行时的 Windows x64 独立发布目录。本文说明需求理解、系统设计、关键算法、异常处理、测试结果、开发过程和 AI 使用情况，并对当前 Git 提交记录与课程提交要求之间的差距进行如实分析。</w:t>
       </w:r>
     </w:p>
     <w:p>
@@ -1524,7 +1524,7 @@
           <w:color w:val="000000"/>
           <w:sz w:val="21"/>
         </w:rPr>
-        <w:t>功能和测试已经达到可演示状态，但仓库当前 `git log` 只有 3 次提交，日期为 2026-10-24 和 2026-10-25 两天，因此没有达到课程要求的“至少 12 次提交、至少 4 个不同日期”。这属于提交过程记录缺失，不是运行功能缺陷。提交前应根据真实开发过程补充合法的阶段性提交和日志截图；不能伪造过去日期或把一次性提交拆成虚假历史。</w:t>
+        <w:t>功能和测试已经达到可演示状态。截至 2026-10-26，仓库共有 12 次真实提交，日期覆盖 2026-10-24、2026-10-25 和 2026-10-26，已经达到提交次数要求，但仍缺少第 4 个真实日期。这属于过程性指标尚未完全满足，不是运行功能缺陷。后续在实际进行一次新的修改、测试和提交后，再补齐第 4 个日期；不能伪造过去日期或把一次性提交拆成虚假历史。</w:t>
       </w:r>
     </w:p>
     <w:p>

</xml_diff>

<commit_message>
docs: align final submission counts
</commit_message>
<xml_diff>
--- a/研究报告_俄罗斯方块.docx
+++ b/研究报告_俄罗斯方块.docx
@@ -1518,13 +1518,7 @@
     </w:p>
     <w:p>
       <w:r>
-        <w:rPr>
-          <w:rFonts w:ascii="Microsoft YaHei" w:hAnsi="Microsoft YaHei" w:eastAsia="Microsoft YaHei"/>
-          <w:b w:val="0"/>
-          <w:color w:val="000000"/>
-          <w:sz w:val="21"/>
-        </w:rPr>
-        <w:t>功能和测试已经达到可演示状态。截至 2026-10-26，仓库共有 12 次真实提交，日期覆盖 2026-10-24、2026-10-25 和 2026-10-26，已经达到提交次数要求，但仍缺少第 4 个真实日期。这属于过程性指标尚未完全满足，不是运行功能缺陷。后续在实际进行一次新的修改、测试和提交后，再补齐第 4 个日期；不能伪造过去日期或把一次性提交拆成虚假历史。</w:t>
+        <w:t>功能和测试已经达到可演示状态。截至 2026-10-26，仓库共有 14 次真实提交，日期覆盖 2026-10-24、2026-10-25 和 2026-10-26，已经超过提交次数要求，但仍缺少第 4 个真实日期。这属于过程性指标尚未完全满足，不是运行功能缺陷。后续在实际进行一次新的修改、测试和提交后，再补齐第 4 个日期；不能伪造过去日期或把一次性提交拆成虚假历史。</w:t>
       </w:r>
     </w:p>
     <w:p>

</xml_diff>